<commit_message>
Round 20bb: record the 2025 candidate corpora and the Gotham fetch status
</commit_message>
<xml_diff>
--- a/重构版论文_v4_20260915/数据与资料来源总表.docx
+++ b/重构版论文_v4_20260915/数据与资料来源总表.docx
@@ -2609,6 +2609,700 @@
                 <w:sz w:val="16"/>
               </w:rPr>
               <w:t>2026-10-01</w:t>
+            </w:r>
+          </w:p>
+        </w:tc>
+      </w:tr>
+    </w:tbl>
+    <w:p>
+      <w:pPr>
+        <w:spacing w:after="40"/>
+      </w:pPr>
+    </w:p>
+    <w:p>
+      <w:r>
+        <w:rPr>
+          <w:b/>
+        </w:rPr>
+        <w:t>候选语料与获取状态（2025 年检索）。</w:t>
+      </w:r>
+      <w:r>
+        <w:t xml:space="preserve"> 为回应「语料年代」的质疑，本文另检索了下列更晚发布的候选数据集；它们</w:t>
+      </w:r>
+      <w:r>
+        <w:rPr>
+          <w:b/>
+        </w:rPr>
+        <w:t>尚未进入正文结果</w:t>
+      </w:r>
+      <w:r>
+        <w:t>，此处登记的是检索与获取状态，以免读者以为作者没有检索过：</w:t>
+      </w:r>
+    </w:p>
+    <w:tbl>
+      <w:tblPr>
+        <w:tblStyle w:val="TableGrid"/>
+        <w:tblW w:type="auto" w:w="0"/>
+        <w:tblLook w:firstColumn="1" w:firstRow="1" w:lastColumn="0" w:lastRow="0" w:noHBand="0" w:noVBand="1" w:val="04A0"/>
+        <w:tblBorders>
+          <w:top w:val="single" w:sz="6" w:space="0" w:color="000000"/>
+          <w:left w:val="none" w:sz="0" w:space="0" w:color="auto"/>
+          <w:bottom w:val="single" w:sz="6" w:space="0" w:color="000000"/>
+          <w:right w:val="none" w:sz="0" w:space="0" w:color="auto"/>
+          <w:insideH w:val="single" w:sz="6" w:space="0" w:color="000000"/>
+          <w:insideV w:val="none" w:sz="0" w:space="0" w:color="auto"/>
+        </w:tblBorders>
+      </w:tblPr>
+      <w:tblGrid>
+        <w:gridCol w:w="1632"/>
+        <w:gridCol w:w="1632"/>
+        <w:gridCol w:w="1632"/>
+        <w:gridCol w:w="1632"/>
+        <w:gridCol w:w="1632"/>
+        <w:gridCol w:w="1632"/>
+      </w:tblGrid>
+      <w:tr>
+        <w:tc>
+          <w:tcPr>
+            <w:tcW w:type="dxa" w:w="1632"/>
+          </w:tcPr>
+          <w:p>
+            <w:pPr>
+              <w:spacing w:after="0"/>
+            </w:pPr>
+            <w:r>
+              <w:rPr>
+                <w:sz w:val="16"/>
+              </w:rPr>
+            </w:r>
+            <w:r>
+              <w:rPr>
+                <w:b/>
+                <w:sz w:val="16"/>
+              </w:rPr>
+              <w:t>数据集</w:t>
+            </w:r>
+          </w:p>
+        </w:tc>
+        <w:tc>
+          <w:tcPr>
+            <w:tcW w:type="dxa" w:w="1632"/>
+          </w:tcPr>
+          <w:p>
+            <w:pPr>
+              <w:spacing w:after="0"/>
+            </w:pPr>
+            <w:r>
+              <w:rPr>
+                <w:sz w:val="16"/>
+              </w:rPr>
+            </w:r>
+            <w:r>
+              <w:rPr>
+                <w:b/>
+                <w:sz w:val="16"/>
+              </w:rPr>
+              <w:t>发布年</w:t>
+            </w:r>
+          </w:p>
+        </w:tc>
+        <w:tc>
+          <w:tcPr>
+            <w:tcW w:type="dxa" w:w="1632"/>
+          </w:tcPr>
+          <w:p>
+            <w:pPr>
+              <w:spacing w:after="0"/>
+            </w:pPr>
+            <w:r>
+              <w:rPr>
+                <w:sz w:val="16"/>
+              </w:rPr>
+            </w:r>
+            <w:r>
+              <w:rPr>
+                <w:b/>
+                <w:sz w:val="16"/>
+              </w:rPr>
+              <w:t>来源</w:t>
+            </w:r>
+          </w:p>
+        </w:tc>
+        <w:tc>
+          <w:tcPr>
+            <w:tcW w:type="dxa" w:w="1632"/>
+          </w:tcPr>
+          <w:p>
+            <w:pPr>
+              <w:spacing w:after="0"/>
+            </w:pPr>
+            <w:r>
+              <w:rPr>
+                <w:sz w:val="16"/>
+              </w:rPr>
+            </w:r>
+            <w:r>
+              <w:rPr>
+                <w:b/>
+                <w:sz w:val="16"/>
+              </w:rPr>
+              <w:t>许可</w:t>
+            </w:r>
+          </w:p>
+        </w:tc>
+        <w:tc>
+          <w:tcPr>
+            <w:tcW w:type="dxa" w:w="1632"/>
+          </w:tcPr>
+          <w:p>
+            <w:pPr>
+              <w:spacing w:after="0"/>
+            </w:pPr>
+            <w:r>
+              <w:rPr>
+                <w:sz w:val="16"/>
+              </w:rPr>
+            </w:r>
+            <w:r>
+              <w:rPr>
+                <w:b/>
+                <w:sz w:val="16"/>
+              </w:rPr>
+              <w:t>获取方式</w:t>
+            </w:r>
+          </w:p>
+        </w:tc>
+        <w:tc>
+          <w:tcPr>
+            <w:tcW w:type="dxa" w:w="1632"/>
+          </w:tcPr>
+          <w:p>
+            <w:pPr>
+              <w:spacing w:after="0"/>
+            </w:pPr>
+            <w:r>
+              <w:rPr>
+                <w:sz w:val="16"/>
+              </w:rPr>
+            </w:r>
+            <w:r>
+              <w:rPr>
+                <w:b/>
+                <w:sz w:val="16"/>
+              </w:rPr>
+              <w:t>状态</w:t>
+            </w:r>
+          </w:p>
+        </w:tc>
+      </w:tr>
+      <w:tr>
+        <w:tc>
+          <w:tcPr>
+            <w:tcW w:type="dxa" w:w="1632"/>
+          </w:tcPr>
+          <w:p>
+            <w:pPr>
+              <w:spacing w:after="0"/>
+            </w:pPr>
+            <w:r>
+              <w:rPr>
+                <w:sz w:val="16"/>
+              </w:rPr>
+            </w:r>
+            <w:r>
+              <w:rPr>
+                <w:sz w:val="16"/>
+              </w:rPr>
+              <w:t>Gotham-2025</w:t>
+            </w:r>
+          </w:p>
+        </w:tc>
+        <w:tc>
+          <w:tcPr>
+            <w:tcW w:type="dxa" w:w="1632"/>
+          </w:tcPr>
+          <w:p>
+            <w:pPr>
+              <w:spacing w:after="0"/>
+            </w:pPr>
+            <w:r>
+              <w:rPr>
+                <w:sz w:val="16"/>
+              </w:rPr>
+            </w:r>
+            <w:r>
+              <w:rPr>
+                <w:sz w:val="16"/>
+              </w:rPr>
+              <w:t>2025</w:t>
+            </w:r>
+          </w:p>
+        </w:tc>
+        <w:tc>
+          <w:tcPr>
+            <w:tcW w:type="dxa" w:w="1632"/>
+          </w:tcPr>
+          <w:p>
+            <w:pPr>
+              <w:spacing w:after="0"/>
+            </w:pPr>
+            <w:r>
+              <w:rPr>
+                <w:sz w:val="16"/>
+              </w:rPr>
+            </w:r>
+            <w:r>
+              <w:rPr>
+                <w:sz w:val="16"/>
+              </w:rPr>
+              <w:t>Zenodo record 14502760（Gotham 测试床，78 台 IoT 设备的接口级流量）</w:t>
+            </w:r>
+          </w:p>
+        </w:tc>
+        <w:tc>
+          <w:tcPr>
+            <w:tcW w:type="dxa" w:w="1632"/>
+          </w:tcPr>
+          <w:p>
+            <w:pPr>
+              <w:spacing w:after="0"/>
+            </w:pPr>
+            <w:r>
+              <w:rPr>
+                <w:sz w:val="16"/>
+              </w:rPr>
+            </w:r>
+            <w:r>
+              <w:rPr>
+                <w:sz w:val="16"/>
+              </w:rPr>
+              <w:t>CC BY 4.0</w:t>
+            </w:r>
+          </w:p>
+        </w:tc>
+        <w:tc>
+          <w:tcPr>
+            <w:tcW w:type="dxa" w:w="1632"/>
+          </w:tcPr>
+          <w:p>
+            <w:pPr>
+              <w:spacing w:after="0"/>
+            </w:pPr>
+            <w:r>
+              <w:rPr>
+                <w:sz w:val="16"/>
+              </w:rPr>
+            </w:r>
+            <w:r>
+              <w:rPr>
+                <w:sz w:val="16"/>
+              </w:rPr>
+              <w:t>开放</w:t>
+            </w:r>
+          </w:p>
+        </w:tc>
+        <w:tc>
+          <w:tcPr>
+            <w:tcW w:type="dxa" w:w="1632"/>
+          </w:tcPr>
+          <w:p>
+            <w:pPr>
+              <w:spacing w:after="0"/>
+            </w:pPr>
+            <w:r>
+              <w:rPr>
+                <w:sz w:val="16"/>
+              </w:rPr>
+            </w:r>
+            <w:r>
+              <w:rPr>
+                <w:sz w:val="16"/>
+              </w:rPr>
+              <w:t>22.2 GiB 单归档；分块续传中，完成后按同一协议处理。（已续传 344/711 块）</w:t>
+            </w:r>
+          </w:p>
+        </w:tc>
+      </w:tr>
+      <w:tr>
+        <w:tc>
+          <w:tcPr>
+            <w:tcW w:type="dxa" w:w="1632"/>
+          </w:tcPr>
+          <w:p>
+            <w:pPr>
+              <w:spacing w:after="0"/>
+            </w:pPr>
+            <w:r>
+              <w:rPr>
+                <w:sz w:val="16"/>
+              </w:rPr>
+            </w:r>
+            <w:r>
+              <w:rPr>
+                <w:sz w:val="16"/>
+              </w:rPr>
+              <w:t>HybRID-18</w:t>
+            </w:r>
+          </w:p>
+        </w:tc>
+        <w:tc>
+          <w:tcPr>
+            <w:tcW w:type="dxa" w:w="1632"/>
+          </w:tcPr>
+          <w:p>
+            <w:pPr>
+              <w:spacing w:after="0"/>
+            </w:pPr>
+            <w:r>
+              <w:rPr>
+                <w:sz w:val="16"/>
+              </w:rPr>
+            </w:r>
+            <w:r>
+              <w:rPr>
+                <w:sz w:val="16"/>
+              </w:rPr>
+              <w:t>2025</w:t>
+            </w:r>
+          </w:p>
+        </w:tc>
+        <w:tc>
+          <w:tcPr>
+            <w:tcW w:type="dxa" w:w="1632"/>
+          </w:tcPr>
+          <w:p>
+            <w:pPr>
+              <w:spacing w:after="0"/>
+            </w:pPr>
+            <w:r>
+              <w:rPr>
+                <w:sz w:val="16"/>
+              </w:rPr>
+            </w:r>
+            <w:r>
+              <w:rPr>
+                <w:sz w:val="16"/>
+              </w:rPr>
+              <w:t>Sadhana 50:272（Indian Academy of Sciences）</w:t>
+            </w:r>
+          </w:p>
+        </w:tc>
+        <w:tc>
+          <w:tcPr>
+            <w:tcW w:type="dxa" w:w="1632"/>
+          </w:tcPr>
+          <w:p>
+            <w:pPr>
+              <w:spacing w:after="0"/>
+            </w:pPr>
+            <w:r>
+              <w:rPr>
+                <w:sz w:val="16"/>
+              </w:rPr>
+            </w:r>
+            <w:r>
+              <w:rPr>
+                <w:sz w:val="16"/>
+              </w:rPr>
+              <w:t>需向作者索取</w:t>
+            </w:r>
+          </w:p>
+        </w:tc>
+        <w:tc>
+          <w:tcPr>
+            <w:tcW w:type="dxa" w:w="1632"/>
+          </w:tcPr>
+          <w:p>
+            <w:pPr>
+              <w:spacing w:after="0"/>
+            </w:pPr>
+            <w:r>
+              <w:rPr>
+                <w:sz w:val="16"/>
+              </w:rPr>
+            </w:r>
+            <w:r>
+              <w:rPr>
+                <w:sz w:val="16"/>
+              </w:rPr>
+              <w:t>未公开</w:t>
+            </w:r>
+          </w:p>
+        </w:tc>
+        <w:tc>
+          <w:tcPr>
+            <w:tcW w:type="dxa" w:w="1632"/>
+          </w:tcPr>
+          <w:p>
+            <w:pPr>
+              <w:spacing w:after="0"/>
+            </w:pPr>
+            <w:r>
+              <w:rPr>
+                <w:sz w:val="16"/>
+              </w:rPr>
+            </w:r>
+            <w:r>
+              <w:rPr>
+                <w:sz w:val="16"/>
+              </w:rPr>
+              <w:t>论文未附公开仓库、DOI 或校验值，无法核对版本与字节，不满足逐字节复现要求。</w:t>
+            </w:r>
+          </w:p>
+        </w:tc>
+      </w:tr>
+      <w:tr>
+        <w:tc>
+          <w:tcPr>
+            <w:tcW w:type="dxa" w:w="1632"/>
+          </w:tcPr>
+          <w:p>
+            <w:pPr>
+              <w:spacing w:after="0"/>
+            </w:pPr>
+            <w:r>
+              <w:rPr>
+                <w:sz w:val="16"/>
+              </w:rPr>
+            </w:r>
+            <w:r>
+              <w:rPr>
+                <w:sz w:val="16"/>
+              </w:rPr>
+              <w:t>CICAPT-IIoT 2024</w:t>
+            </w:r>
+          </w:p>
+        </w:tc>
+        <w:tc>
+          <w:tcPr>
+            <w:tcW w:type="dxa" w:w="1632"/>
+          </w:tcPr>
+          <w:p>
+            <w:pPr>
+              <w:spacing w:after="0"/>
+            </w:pPr>
+            <w:r>
+              <w:rPr>
+                <w:sz w:val="16"/>
+              </w:rPr>
+            </w:r>
+            <w:r>
+              <w:rPr>
+                <w:sz w:val="16"/>
+              </w:rPr>
+              <w:t>2024</w:t>
+            </w:r>
+          </w:p>
+        </w:tc>
+        <w:tc>
+          <w:tcPr>
+            <w:tcW w:type="dxa" w:w="1632"/>
+          </w:tcPr>
+          <w:p>
+            <w:pPr>
+              <w:spacing w:after="0"/>
+            </w:pPr>
+            <w:r>
+              <w:rPr>
+                <w:sz w:val="16"/>
+              </w:rPr>
+            </w:r>
+            <w:r>
+              <w:rPr>
+                <w:sz w:val="16"/>
+              </w:rPr>
+              <w:t>UNB CIC（APT 溯源日志 + 网络流量）</w:t>
+            </w:r>
+          </w:p>
+        </w:tc>
+        <w:tc>
+          <w:tcPr>
+            <w:tcW w:type="dxa" w:w="1632"/>
+          </w:tcPr>
+          <w:p>
+            <w:pPr>
+              <w:spacing w:after="0"/>
+            </w:pPr>
+            <w:r>
+              <w:rPr>
+                <w:sz w:val="16"/>
+              </w:rPr>
+            </w:r>
+            <w:r>
+              <w:rPr>
+                <w:sz w:val="16"/>
+              </w:rPr>
+              <w:t>申请制</w:t>
+            </w:r>
+          </w:p>
+        </w:tc>
+        <w:tc>
+          <w:tcPr>
+            <w:tcW w:type="dxa" w:w="1632"/>
+          </w:tcPr>
+          <w:p>
+            <w:pPr>
+              <w:spacing w:after="0"/>
+            </w:pPr>
+            <w:r>
+              <w:rPr>
+                <w:sz w:val="16"/>
+              </w:rPr>
+            </w:r>
+            <w:r>
+              <w:rPr>
+                <w:sz w:val="16"/>
+              </w:rPr>
+              <w:t>申请制</w:t>
+            </w:r>
+          </w:p>
+        </w:tc>
+        <w:tc>
+          <w:tcPr>
+            <w:tcW w:type="dxa" w:w="1632"/>
+          </w:tcPr>
+          <w:p>
+            <w:pPr>
+              <w:spacing w:after="0"/>
+            </w:pPr>
+            <w:r>
+              <w:rPr>
+                <w:sz w:val="16"/>
+              </w:rPr>
+            </w:r>
+            <w:r>
+              <w:rPr>
+                <w:sz w:val="16"/>
+              </w:rPr>
+              <w:t>经 CIC 在线申请表发放，需提交个人与机构信息；本机无授权下载入口。</w:t>
+            </w:r>
+          </w:p>
+        </w:tc>
+      </w:tr>
+      <w:tr>
+        <w:tc>
+          <w:tcPr>
+            <w:tcW w:type="dxa" w:w="1632"/>
+          </w:tcPr>
+          <w:p>
+            <w:pPr>
+              <w:spacing w:after="0"/>
+            </w:pPr>
+            <w:r>
+              <w:rPr>
+                <w:sz w:val="16"/>
+              </w:rPr>
+            </w:r>
+            <w:r>
+              <w:rPr>
+                <w:sz w:val="16"/>
+              </w:rPr>
+              <w:t>DataSense CIC IIoT 2025</w:t>
+            </w:r>
+          </w:p>
+        </w:tc>
+        <w:tc>
+          <w:tcPr>
+            <w:tcW w:type="dxa" w:w="1632"/>
+          </w:tcPr>
+          <w:p>
+            <w:pPr>
+              <w:spacing w:after="0"/>
+            </w:pPr>
+            <w:r>
+              <w:rPr>
+                <w:sz w:val="16"/>
+              </w:rPr>
+            </w:r>
+            <w:r>
+              <w:rPr>
+                <w:sz w:val="16"/>
+              </w:rPr>
+              <w:t>2025</w:t>
+            </w:r>
+          </w:p>
+        </w:tc>
+        <w:tc>
+          <w:tcPr>
+            <w:tcW w:type="dxa" w:w="1632"/>
+          </w:tcPr>
+          <w:p>
+            <w:pPr>
+              <w:spacing w:after="0"/>
+            </w:pPr>
+            <w:r>
+              <w:rPr>
+                <w:sz w:val="16"/>
+              </w:rPr>
+            </w:r>
+            <w:r>
+              <w:rPr>
+                <w:sz w:val="16"/>
+              </w:rPr>
+              <w:t>UNB CIC（Electronics 14:4095）</w:t>
+            </w:r>
+          </w:p>
+        </w:tc>
+        <w:tc>
+          <w:tcPr>
+            <w:tcW w:type="dxa" w:w="1632"/>
+          </w:tcPr>
+          <w:p>
+            <w:pPr>
+              <w:spacing w:after="0"/>
+            </w:pPr>
+            <w:r>
+              <w:rPr>
+                <w:sz w:val="16"/>
+              </w:rPr>
+            </w:r>
+            <w:r>
+              <w:rPr>
+                <w:sz w:val="16"/>
+              </w:rPr>
+              <w:t>申请制</w:t>
+            </w:r>
+          </w:p>
+        </w:tc>
+        <w:tc>
+          <w:tcPr>
+            <w:tcW w:type="dxa" w:w="1632"/>
+          </w:tcPr>
+          <w:p>
+            <w:pPr>
+              <w:spacing w:after="0"/>
+            </w:pPr>
+            <w:r>
+              <w:rPr>
+                <w:sz w:val="16"/>
+              </w:rPr>
+            </w:r>
+            <w:r>
+              <w:rPr>
+                <w:sz w:val="16"/>
+              </w:rPr>
+              <w:t>申请制</w:t>
+            </w:r>
+          </w:p>
+        </w:tc>
+        <w:tc>
+          <w:tcPr>
+            <w:tcW w:type="dxa" w:w="1632"/>
+          </w:tcPr>
+          <w:p>
+            <w:pPr>
+              <w:spacing w:after="0"/>
+            </w:pPr>
+            <w:r>
+              <w:rPr>
+                <w:sz w:val="16"/>
+              </w:rPr>
+            </w:r>
+            <w:r>
+              <w:rPr>
+                <w:sz w:val="16"/>
+              </w:rPr>
+              <w:t>CIC 下载表单发放；任务设定为传感器基准，与流特征分类协议不可直接比较。</w:t>
             </w:r>
           </w:p>
         </w:tc>
@@ -6745,7 +7439,7 @@
               <w:rPr>
                 <w:sz w:val="16"/>
               </w:rPr>
-              <w:t>（869 个文件）</w:t>
+              <w:t>（871 个文件）</w:t>
             </w:r>
           </w:p>
         </w:tc>

</xml_diff>